<commit_message>
Modified files to accomodate user details.
</commit_message>
<xml_diff>
--- a/SaiNikitha-Day10-NotificationApp-Three_3-Tier-Arch.docx
+++ b/SaiNikitha-Day10-NotificationApp-Three_3-Tier-Arch.docx
@@ -4980,6 +4980,9 @@
       <w:r>
         <w:t>Delete Notification</w:t>
       </w:r>
+      <w:r>
+        <w:t>s</w:t>
+      </w:r>
     </w:p>
     <w:p>
       <w:pPr>
@@ -5051,24 +5054,47 @@
     </w:p>
     <w:p>
       <w:pPr>
-        <w:pStyle w:val="Heading2"/>
-      </w:pPr>
-    </w:p>
-    <w:p/>
-    <w:p>
-      <w:pPr>
-        <w:pStyle w:val="Heading2"/>
-      </w:pPr>
-    </w:p>
-    <w:p>
-      <w:pPr>
-        <w:ind w:left="1080"/>
-      </w:pPr>
-    </w:p>
-    <w:p>
-      <w:r>
-        <w:t xml:space="preserve"> </w:t>
-      </w:r>
+        <w:spacing w:before="100" w:beforeAutospacing="1" w:after="100" w:afterAutospacing="1" w:line="240" w:lineRule="auto"/>
+        <w:rPr>
+          <w:i/>
+          <w:iCs/>
+          <w:color w:val="0F4761" w:themeColor="accent1" w:themeShade="BF"/>
+        </w:rPr>
+      </w:pPr>
+      <w:proofErr w:type="spellStart"/>
+      <w:r>
+        <w:rPr>
+          <w:rStyle w:val="IntenseEmphasis"/>
+        </w:rPr>
+        <w:t>Github</w:t>
+      </w:r>
+      <w:proofErr w:type="spellEnd"/>
+      <w:r>
+        <w:rPr>
+          <w:rStyle w:val="IntenseEmphasis"/>
+        </w:rPr>
+        <w:t xml:space="preserve"> Link : </w:t>
+      </w:r>
+      <w:hyperlink r:id="rId11" w:history="1">
+        <w:r>
+          <w:rPr>
+            <w:rStyle w:val="Hyperlink"/>
+          </w:rPr>
+          <w:t>Click he</w:t>
+        </w:r>
+        <w:r>
+          <w:rPr>
+            <w:rStyle w:val="Hyperlink"/>
+          </w:rPr>
+          <w:t>r</w:t>
+        </w:r>
+        <w:r>
+          <w:rPr>
+            <w:rStyle w:val="Hyperlink"/>
+          </w:rPr>
+          <w:t>e</w:t>
+        </w:r>
+      </w:hyperlink>
     </w:p>
     <w:p>
       <w:pPr>
@@ -9916,6 +9942,18 @@
       <w:szCs w:val="20"/>
     </w:rPr>
   </w:style>
+  <w:style w:type="character" w:styleId="FollowedHyperlink">
+    <w:name w:val="FollowedHyperlink"/>
+    <w:basedOn w:val="DefaultParagraphFont"/>
+    <w:uiPriority w:val="99"/>
+    <w:semiHidden/>
+    <w:unhideWhenUsed/>
+    <w:rsid w:val="000326AE"/>
+    <w:rPr>
+      <w:color w:val="96607D" w:themeColor="followedHyperlink"/>
+      <w:u w:val="single"/>
+    </w:rPr>
+  </w:style>
 </w:styles>
 </file>
 

</xml_diff>